<commit_message>
se hace el cambio de obligatorios y descargas en pdf
</commit_message>
<xml_diff>
--- a/public/convenios/LGD-01.docx
+++ b/public/convenios/LGD-01.docx
@@ -118,113 +118,6 @@
           <w:szCs w:val="22"/>
         </w:rPr>
       </w:pPr>
-      <w:r>
-        <w:rPr>
-          <w:rFonts w:eastAsiaTheme="minorEastAsia" w:cstheme="minorHAnsi"/>
-          <w:b/>
-          <w:bCs/>
-          <w:noProof/>
-          <w:spacing w:val="2"/>
-        </w:rPr>
-        <mc:AlternateContent>
-          <mc:Choice Requires="wps">
-            <w:drawing>
-              <wp:anchor distT="0" distB="0" distL="114300" distR="114300" simplePos="0" relativeHeight="251664384" behindDoc="0" locked="0" layoutInCell="1" allowOverlap="1" wp14:anchorId="6E025D69" wp14:editId="787CC4A1">
-                <wp:simplePos x="0" y="0"/>
-                <wp:positionH relativeFrom="column">
-                  <wp:posOffset>4377690</wp:posOffset>
-                </wp:positionH>
-                <wp:positionV relativeFrom="paragraph">
-                  <wp:posOffset>4445</wp:posOffset>
-                </wp:positionV>
-                <wp:extent cx="1684020" cy="792480"/>
-                <wp:effectExtent l="0" t="0" r="0" b="7620"/>
-                <wp:wrapNone/>
-                <wp:docPr id="2" name="Cuadro de texto 2"/>
-                <wp:cNvGraphicFramePr/>
-                <a:graphic xmlns:a="http://schemas.openxmlformats.org/drawingml/2006/main">
-                  <a:graphicData uri="http://schemas.microsoft.com/office/word/2010/wordprocessingShape">
-                    <wps:wsp>
-                      <wps:cNvSpPr txBox="1"/>
-                      <wps:spPr>
-                        <a:xfrm>
-                          <a:off x="0" y="0"/>
-                          <a:ext cx="1684020" cy="792480"/>
-                        </a:xfrm>
-                        <a:prstGeom prst="rect">
-                          <a:avLst/>
-                        </a:prstGeom>
-                        <a:solidFill>
-                          <a:schemeClr val="lt1"/>
-                        </a:solidFill>
-                        <a:ln w="6350">
-                          <a:noFill/>
-                        </a:ln>
-                      </wps:spPr>
-                      <wps:txbx>
-                        <w:txbxContent>
-                          <w:p>
-                            <w:pPr>
-                              <w:rPr>
-                                <w:rFonts w:asciiTheme="minorHAnsi" w:hAnsiTheme="minorHAnsi" w:cstheme="minorHAnsi"/>
-                              </w:rPr>
-                            </w:pPr>
-                            <w:r>
-                              <w:rPr>
-                                <w:rFonts w:asciiTheme="minorHAnsi" w:hAnsiTheme="minorHAnsi" w:cstheme="minorHAnsi"/>
-                              </w:rPr>
-                              <w:t>{{LOGO}}</w:t>
-                            </w:r>
-                          </w:p>
-                        </w:txbxContent>
-                      </wps:txbx>
-                      <wps:bodyPr rot="0" spcFirstLastPara="0" vertOverflow="overflow" horzOverflow="overflow" vert="horz" wrap="square" lIns="91440" tIns="45720" rIns="91440" bIns="45720" numCol="1" spcCol="0" rtlCol="0" fromWordArt="0" anchor="t" anchorCtr="0" forceAA="0" compatLnSpc="1">
-                        <a:prstTxWarp prst="textNoShape">
-                          <a:avLst/>
-                        </a:prstTxWarp>
-                        <a:noAutofit/>
-                      </wps:bodyPr>
-                    </wps:wsp>
-                  </a:graphicData>
-                </a:graphic>
-                <wp14:sizeRelH relativeFrom="margin">
-                  <wp14:pctWidth>0</wp14:pctWidth>
-                </wp14:sizeRelH>
-                <wp14:sizeRelV relativeFrom="margin">
-                  <wp14:pctHeight>0</wp14:pctHeight>
-                </wp14:sizeRelV>
-              </wp:anchor>
-            </w:drawing>
-          </mc:Choice>
-          <mc:Fallback>
-            <w:pict>
-              <v:shapetype w14:anchorId="6E025D69" id="_x0000_t202" coordsize="21600,21600" o:spt="202" path="m,l,21600r21600,l21600,xe">
-                <v:stroke joinstyle="miter"/>
-                <v:path gradientshapeok="t" o:connecttype="rect"/>
-              </v:shapetype>
-              <v:shape id="Cuadro de texto 2" o:spid="_x0000_s1026" type="#_x0000_t202" style="position:absolute;left:0;text-align:left;margin-left:344.7pt;margin-top:.35pt;width:132.6pt;height:62.4pt;z-index:251664384;visibility:visible;mso-wrap-style:square;mso-width-percent:0;mso-height-percent:0;mso-wrap-distance-left:9pt;mso-wrap-distance-top:0;mso-wrap-distance-right:9pt;mso-wrap-distance-bottom:0;mso-position-horizontal:absolute;mso-position-horizontal-relative:text;mso-position-vertical:absolute;mso-position-vertical-relative:text;mso-width-percent:0;mso-height-percent:0;mso-width-relative:margin;mso-height-relative:margin;v-text-anchor:top" o:gfxdata="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" fillcolor="white [3201]" stroked="f" strokeweight=".5pt">
-                <v:textbox>
-                  <w:txbxContent>
-                    <w:p>
-                      <w:pPr>
-                        <w:rPr>
-                          <w:rFonts w:asciiTheme="minorHAnsi" w:hAnsiTheme="minorHAnsi" w:cstheme="minorHAnsi"/>
-                        </w:rPr>
-                      </w:pPr>
-                      <w:r>
-                        <w:rPr>
-                          <w:rFonts w:asciiTheme="minorHAnsi" w:hAnsiTheme="minorHAnsi" w:cstheme="minorHAnsi"/>
-                        </w:rPr>
-                        <w:t>{{LOGO}}</w:t>
-                      </w:r>
-                    </w:p>
-                  </w:txbxContent>
-                </v:textbox>
-              </v:shape>
-            </w:pict>
-          </mc:Fallback>
-        </mc:AlternateContent>
-      </w:r>
     </w:p>
     <w:p>
       <w:pPr>
@@ -445,7 +338,7 @@
           <w:sz w:val="22"/>
           <w:szCs w:val="22"/>
         </w:rPr>
-        <w:t xml:space="preserve"> según consta en la escritura de poder otorgada por __________ en la fecha __________, con el número __________ de protocolo.</w:t>
+        <w:t xml:space="preserve"> según consta en la escritura de poder otorgada por {{PODER_OTORGADO_POR}} en la fecha {{FECHA_PODER}}, con el número {{NUMERO_PROTOCOLO}} de protocolo.</w:t>
       </w:r>
     </w:p>
     <w:p>
@@ -751,25 +644,7 @@
           <w:sz w:val="22"/>
           <w:szCs w:val="22"/>
         </w:rPr>
-        <w:t xml:space="preserve">, tiene personalidad jurídica propia y goza de capacidad de obrar, rigiéndose en cuanto a su organización y funcionamiento por sus Estatutos de Constitución y por las demás normas y disposiciones que, en interpretación y desarrollo de </w:t>
-      </w:r>
-      <w:proofErr w:type="gramStart"/>
-      <w:r>
-        <w:rPr>
-          <w:rFonts w:asciiTheme="minorHAnsi" w:hAnsiTheme="minorHAnsi" w:cstheme="minorHAnsi"/>
-          <w:sz w:val="22"/>
-          <w:szCs w:val="22"/>
-        </w:rPr>
-        <w:t>los mismos</w:t>
-      </w:r>
-      <w:proofErr w:type="gramEnd"/>
-      <w:r>
-        <w:rPr>
-          <w:rFonts w:asciiTheme="minorHAnsi" w:hAnsiTheme="minorHAnsi" w:cstheme="minorHAnsi"/>
-          <w:sz w:val="22"/>
-          <w:szCs w:val="22"/>
-        </w:rPr>
-        <w:t>, establezca su Patronato.</w:t>
+        <w:t>, tiene personalidad jurídica propia y goza de capacidad de obrar, rigiéndose en cuanto a su organización y funcionamiento por sus Estatutos de Constitución y por las demás normas y disposiciones que, en interpretación y desarrollo de los mismos, establezca su Patronato.</w:t>
       </w:r>
     </w:p>
     <w:p>
@@ -1893,25 +1768,7 @@
           <w:sz w:val="22"/>
           <w:szCs w:val="22"/>
         </w:rPr>
-        <w:t>En atención a la aplicación de las medidas alternativas de carácter excepcional establecidas por el por el Real Decreto 364/2005 para el cumplimiento de la Ley General de Derechos de las Personas con Discapacidad y de su Inclusión Social, las Partes establecen la vigencia del presente Acuerdo por el plazo de {{PLAZO_ANIOS</w:t>
-      </w:r>
-      <w:proofErr w:type="gramStart"/>
-      <w:r>
-        <w:rPr>
-          <w:rFonts w:asciiTheme="minorHAnsi" w:hAnsiTheme="minorHAnsi" w:cstheme="minorHAnsi"/>
-          <w:sz w:val="22"/>
-          <w:szCs w:val="22"/>
-        </w:rPr>
-        <w:t>}}  desde</w:t>
-      </w:r>
-      <w:proofErr w:type="gramEnd"/>
-      <w:r>
-        <w:rPr>
-          <w:rFonts w:asciiTheme="minorHAnsi" w:hAnsiTheme="minorHAnsi" w:cstheme="minorHAnsi"/>
-          <w:sz w:val="22"/>
-          <w:szCs w:val="22"/>
-        </w:rPr>
-        <w:t xml:space="preserve"> la fecha de su firma. En cualquier caso, una vez finalizado el presente Acuerdo, éste podrá prorrogarse por acuerdo expreso y por escrito de ambas Partes y por periodos de igual duración.</w:t>
+        <w:t>En atención a la aplicación de las medidas alternativas de carácter excepcional establecidas por el por el Real Decreto 364/2005 para el cumplimiento de la Ley General de Derechos de las Personas con Discapacidad y de su Inclusión Social, las Partes establecen la vigencia del presente Acuerdo por el plazo de {{PLAZO_ANIOS}}  desde la fecha de su firma. En cualquier caso, una vez finalizado el presente Acuerdo, éste podrá prorrogarse por acuerdo expreso y por escrito de ambas Partes y por periodos de igual duración.</w:t>
       </w:r>
     </w:p>
     <w:p>
@@ -2132,90 +1989,36 @@
           <w:sz w:val="22"/>
           <w:szCs w:val="22"/>
         </w:rPr>
-        <w:t xml:space="preserve">Por tanto, las Partes expresamente acuerdan que cada una de ellas actúa como </w:t>
-      </w:r>
-      <w:proofErr w:type="gramStart"/>
-      <w:r>
-        <w:rPr>
-          <w:rFonts w:asciiTheme="minorHAnsi" w:hAnsiTheme="minorHAnsi" w:cstheme="minorBidi"/>
-          <w:sz w:val="22"/>
-          <w:szCs w:val="22"/>
-        </w:rPr>
-        <w:t>Responsable</w:t>
-      </w:r>
-      <w:proofErr w:type="gramEnd"/>
-      <w:r>
-        <w:rPr>
-          <w:rFonts w:asciiTheme="minorHAnsi" w:hAnsiTheme="minorHAnsi" w:cstheme="minorBidi"/>
-          <w:sz w:val="22"/>
-          <w:szCs w:val="22"/>
-        </w:rPr>
-        <w:t xml:space="preserve"> del Tratamiento de los Datos Personales recopilados y tratados para la gestión de la relación contractual como se define anteriormente.</w:t>
-      </w:r>
-    </w:p>
-    <w:p>
-      <w:pPr>
-        <w:jc w:val="both"/>
-        <w:rPr>
-          <w:rFonts w:asciiTheme="minorHAnsi" w:hAnsiTheme="minorHAnsi" w:cstheme="minorHAnsi"/>
-          <w:sz w:val="22"/>
-          <w:szCs w:val="22"/>
-          <w:lang w:val="es-ES_tradnl"/>
-        </w:rPr>
-      </w:pPr>
-    </w:p>
-    <w:p>
-      <w:pPr>
-        <w:jc w:val="both"/>
-        <w:rPr>
-          <w:rFonts w:asciiTheme="minorHAnsi" w:hAnsiTheme="minorHAnsi" w:cstheme="minorHAnsi"/>
-          <w:sz w:val="22"/>
-          <w:szCs w:val="22"/>
-        </w:rPr>
-      </w:pPr>
-      <w:r>
-        <w:rPr>
-          <w:rFonts w:asciiTheme="minorHAnsi" w:hAnsiTheme="minorHAnsi" w:cstheme="minorHAnsi"/>
-          <w:sz w:val="22"/>
-          <w:szCs w:val="22"/>
-        </w:rPr>
-        <w:t xml:space="preserve">Así mismo, las Partes manifiestan que el </w:t>
-      </w:r>
-      <w:proofErr w:type="gramStart"/>
-      <w:r>
-        <w:rPr>
-          <w:rFonts w:asciiTheme="minorHAnsi" w:hAnsiTheme="minorHAnsi" w:cstheme="minorHAnsi"/>
-          <w:sz w:val="22"/>
-          <w:szCs w:val="22"/>
-        </w:rPr>
-        <w:t>Delegado</w:t>
-      </w:r>
-      <w:proofErr w:type="gramEnd"/>
-      <w:r>
-        <w:rPr>
-          <w:rFonts w:asciiTheme="minorHAnsi" w:hAnsiTheme="minorHAnsi" w:cstheme="minorHAnsi"/>
-          <w:sz w:val="22"/>
-          <w:szCs w:val="22"/>
-        </w:rPr>
-        <w:t xml:space="preserve"> de Protección de Datos es la figura encargada de hacer efectivo el cumplimiento de la normativa de protección de datos. Los interesados podrán ponerse en contacto con el </w:t>
-      </w:r>
-      <w:proofErr w:type="gramStart"/>
-      <w:r>
-        <w:rPr>
-          <w:rFonts w:asciiTheme="minorHAnsi" w:hAnsiTheme="minorHAnsi" w:cstheme="minorHAnsi"/>
-          <w:sz w:val="22"/>
-          <w:szCs w:val="22"/>
-        </w:rPr>
-        <w:t>Delegado</w:t>
-      </w:r>
-      <w:proofErr w:type="gramEnd"/>
-      <w:r>
-        <w:rPr>
-          <w:rFonts w:asciiTheme="minorHAnsi" w:hAnsiTheme="minorHAnsi" w:cstheme="minorHAnsi"/>
-          <w:sz w:val="22"/>
-          <w:szCs w:val="22"/>
-        </w:rPr>
-        <w:t xml:space="preserve"> de Protección de Datos cuyos datos de contacto se indican a continuación:</w:t>
+        <w:t>Por tanto, las Partes expresamente acuerdan que cada una de ellas actúa como Responsable del Tratamiento de los Datos Personales recopilados y tratados para la gestión de la relación contractual como se define anteriormente.</w:t>
+      </w:r>
+    </w:p>
+    <w:p>
+      <w:pPr>
+        <w:jc w:val="both"/>
+        <w:rPr>
+          <w:rFonts w:asciiTheme="minorHAnsi" w:hAnsiTheme="minorHAnsi" w:cstheme="minorHAnsi"/>
+          <w:sz w:val="22"/>
+          <w:szCs w:val="22"/>
+          <w:lang w:val="es-ES_tradnl"/>
+        </w:rPr>
+      </w:pPr>
+    </w:p>
+    <w:p>
+      <w:pPr>
+        <w:jc w:val="both"/>
+        <w:rPr>
+          <w:rFonts w:asciiTheme="minorHAnsi" w:hAnsiTheme="minorHAnsi" w:cstheme="minorHAnsi"/>
+          <w:sz w:val="22"/>
+          <w:szCs w:val="22"/>
+        </w:rPr>
+      </w:pPr>
+      <w:r>
+        <w:rPr>
+          <w:rFonts w:asciiTheme="minorHAnsi" w:hAnsiTheme="minorHAnsi" w:cstheme="minorHAnsi"/>
+          <w:sz w:val="22"/>
+          <w:szCs w:val="22"/>
+        </w:rPr>
+        <w:t>Así mismo, las Partes manifiestan que el Delegado de Protección de Datos es la figura encargada de hacer efectivo el cumplimiento de la normativa de protección de datos. Los interesados podrán ponerse en contacto con el Delegado de Protección de Datos cuyos datos de contacto se indican a continuación:</w:t>
       </w:r>
     </w:p>
     <w:p>
@@ -3275,7 +3078,11 @@
           </mc:Choice>
           <mc:Fallback>
             <w:pict>
-              <v:shape w14:anchorId="576762B2" id="Cuadro de texto 4" o:spid="_x0000_s1027" type="#_x0000_t202" style="position:absolute;left:0;text-align:left;margin-left:92.95pt;margin-top:2.9pt;width:8.45pt;height:8.45pt;z-index:251661312;visibility:visible;mso-wrap-style:square;mso-wrap-distance-left:9pt;mso-wrap-distance-top:0;mso-wrap-distance-right:9pt;mso-wrap-distance-bottom:0;mso-position-horizontal:absolute;mso-position-horizontal-relative:text;mso-position-vertical:absolute;mso-position-vertical-relative:text;v-text-anchor:top" o:gfxdata="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" fillcolor="white [3201]" strokecolor="black [3200]" strokeweight="2pt">
+              <v:shapetype w14:anchorId="576762B2" id="_x0000_t202" coordsize="21600,21600" o:spt="202" path="m,l,21600r21600,l21600,xe">
+                <v:stroke joinstyle="miter"/>
+                <v:path gradientshapeok="t" o:connecttype="rect"/>
+              </v:shapetype>
+              <v:shape id="Cuadro de texto 4" o:spid="_x0000_s1026" type="#_x0000_t202" style="position:absolute;left:0;text-align:left;margin-left:92.95pt;margin-top:2.9pt;width:8.45pt;height:8.45pt;z-index:251661312;visibility:visible;mso-wrap-style:square;mso-wrap-distance-left:9pt;mso-wrap-distance-top:0;mso-wrap-distance-right:9pt;mso-wrap-distance-bottom:0;mso-position-horizontal:absolute;mso-position-horizontal-relative:text;mso-position-vertical:absolute;mso-position-vertical-relative:text;v-text-anchor:top" o:gfxdata="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" fillcolor="white [3201]" strokecolor="black [3200]" strokeweight="2pt">
                 <v:textbox>
                   <w:txbxContent>
                     <w:p/>
@@ -3357,7 +3164,7 @@
           </mc:Choice>
           <mc:Fallback>
             <w:pict>
-              <v:shape w14:anchorId="21D340D5" id="Cuadro de texto 3" o:spid="_x0000_s1028" type="#_x0000_t202" style="position:absolute;left:0;text-align:left;margin-left:18.75pt;margin-top:2.6pt;width:8.45pt;height:8.45pt;z-index:251659264;visibility:visible;mso-wrap-style:square;mso-wrap-distance-left:9pt;mso-wrap-distance-top:0;mso-wrap-distance-right:9pt;mso-wrap-distance-bottom:0;mso-position-horizontal:absolute;mso-position-horizontal-relative:text;mso-position-vertical:absolute;mso-position-vertical-relative:text;v-text-anchor:top" o:gfxdata="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" fillcolor="white [3201]" strokecolor="black [3200]" strokeweight="2pt">
+              <v:shape w14:anchorId="21D340D5" id="Cuadro de texto 3" o:spid="_x0000_s1027" type="#_x0000_t202" style="position:absolute;left:0;text-align:left;margin-left:18.75pt;margin-top:2.6pt;width:8.45pt;height:8.45pt;z-index:251659264;visibility:visible;mso-wrap-style:square;mso-wrap-distance-left:9pt;mso-wrap-distance-top:0;mso-wrap-distance-right:9pt;mso-wrap-distance-bottom:0;mso-position-horizontal:absolute;mso-position-horizontal-relative:text;mso-position-vertical:absolute;mso-position-vertical-relative:text;v-text-anchor:top" o:gfxdata="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" fillcolor="white [3201]" strokecolor="black [3200]" strokeweight="2pt">
                 <v:textbox>
                   <w:txbxContent>
                     <w:p/>
@@ -3431,29 +3238,7 @@
           <w:szCs w:val="22"/>
           <w:lang w:val="es-ES_tradnl"/>
         </w:rPr>
-        <w:t>Importe de la Donación: {{IMPORTE</w:t>
-      </w:r>
-      <w:proofErr w:type="gramStart"/>
-      <w:r>
-        <w:rPr>
-          <w:rFonts w:asciiTheme="minorHAnsi" w:hAnsiTheme="minorHAnsi" w:cstheme="minorHAnsi"/>
-          <w:spacing w:val="-3"/>
-          <w:sz w:val="22"/>
-          <w:szCs w:val="22"/>
-          <w:lang w:val="es-ES_tradnl"/>
-        </w:rPr>
-        <w:t>}}€</w:t>
-      </w:r>
-      <w:proofErr w:type="gramEnd"/>
-      <w:r>
-        <w:rPr>
-          <w:rFonts w:asciiTheme="minorHAnsi" w:hAnsiTheme="minorHAnsi" w:cstheme="minorHAnsi"/>
-          <w:spacing w:val="-3"/>
-          <w:sz w:val="22"/>
-          <w:szCs w:val="22"/>
-          <w:lang w:val="es-ES_tradnl"/>
-        </w:rPr>
-        <w:t xml:space="preserve"> ({{IMPORTE_LETRAS}} EUROS)</w:t>
+        <w:t>Importe de la Donación: {{IMPORTE}}€ ({{IMPORTE_LETRAS}} EUROS)</w:t>
       </w:r>
     </w:p>
     <w:p>
@@ -3838,7 +3623,7 @@
               <v:stroke joinstyle="miter"/>
               <v:path gradientshapeok="t" o:connecttype="rect"/>
             </v:shapetype>
-            <v:shape id="MSIPCM41c04b5ea11cb47ffac04b57" o:spid="_x0000_s1029" type="#_x0000_t202" alt="{&quot;HashCode&quot;:615583845,&quot;Height&quot;:841.0,&quot;Width&quot;:595.0,&quot;Placement&quot;:&quot;Footer&quot;,&quot;Index&quot;:&quot;Primary&quot;,&quot;Section&quot;:1,&quot;Top&quot;:0.0,&quot;Left&quot;:0.0}" style="position:absolute;left:0;text-align:left;margin-left:-92.25pt;margin-top:795.4pt;width:595.3pt;height:21pt;z-index:251661312;visibility:visible;mso-wrap-style:square;mso-wrap-distance-left:9pt;mso-wrap-distance-top:0;mso-wrap-distance-right:9pt;mso-wrap-distance-bottom:0;mso-position-horizontal:absolute;mso-position-horizontal-relative:page;mso-position-vertical:absolute;mso-position-vertical-relative:page;v-text-anchor:bottom" o:gfxdata="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" o:allowincell="f" filled="f" stroked="f" strokeweight=".5pt">
+            <v:shape id="MSIPCM41c04b5ea11cb47ffac04b57" o:spid="_x0000_s1028" type="#_x0000_t202" alt="{&quot;HashCode&quot;:615583845,&quot;Height&quot;:841.0,&quot;Width&quot;:595.0,&quot;Placement&quot;:&quot;Footer&quot;,&quot;Index&quot;:&quot;Primary&quot;,&quot;Section&quot;:1,&quot;Top&quot;:0.0,&quot;Left&quot;:0.0}" style="position:absolute;left:0;text-align:left;margin-left:-92.25pt;margin-top:795.4pt;width:595.3pt;height:21pt;z-index:251661312;visibility:visible;mso-wrap-style:square;mso-wrap-distance-left:9pt;mso-wrap-distance-top:0;mso-wrap-distance-right:9pt;mso-wrap-distance-bottom:0;mso-position-horizontal:absolute;mso-position-horizontal-relative:page;mso-position-vertical:absolute;mso-position-vertical-relative:page;v-text-anchor:bottom" o:gfxdata="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" o:allowincell="f" filled="f" stroked="f" strokeweight=".5pt">
               <v:textbox inset=",0,,0">
                 <w:txbxContent>
                   <w:p>
@@ -6006,15 +5791,21 @@
 </file>
 
 <file path=customXml/item1.xml><?xml version="1.0" encoding="utf-8"?>
-<?mso-contentType ?>
-<FormTemplates xmlns="http://schemas.microsoft.com/sharepoint/v3/contenttype/forms">
-  <Display>DocumentLibraryForm</Display>
-  <Edit>DocumentLibraryForm</Edit>
-  <New>DocumentLibraryForm</New>
-</FormTemplates>
+<p:properties xmlns:p="http://schemas.microsoft.com/office/2006/metadata/properties" xmlns:xsi="http://www.w3.org/2001/XMLSchema-instance" xmlns:pc="http://schemas.microsoft.com/office/infopath/2007/PartnerControls">
+  <documentManagement>
+    <TaxCatchAll xmlns="cb90855b-590b-4046-bde3-5b9a5aa76822" xsi:nil="true"/>
+    <lcf76f155ced4ddcb4097134ff3c332f xmlns="2cad0c96-b44f-494c-bd1a-65b9e73a9232">
+      <Terms xmlns="http://schemas.microsoft.com/office/infopath/2007/PartnerControls"/>
+    </lcf76f155ced4ddcb4097134ff3c332f>
+  </documentManagement>
+</p:properties>
 </file>
 
 <file path=customXml/item2.xml><?xml version="1.0" encoding="utf-8"?>
+<b:Sources xmlns:b="http://schemas.openxmlformats.org/officeDocument/2006/bibliography" xmlns="http://schemas.openxmlformats.org/officeDocument/2006/bibliography" SelectedStyle="\APASixthEditionOfficeOnline.xsl" StyleName="APA" Version="6"/>
+</file>
+
+<file path=customXml/item3.xml><?xml version="1.0" encoding="utf-8"?>
 <ct:contentTypeSchema xmlns:ct="http://schemas.microsoft.com/office/2006/metadata/contentType" xmlns:ma="http://schemas.microsoft.com/office/2006/metadata/properties/metaAttributes" ct:_="" ma:_="" ma:contentTypeName="Documento" ma:contentTypeID="0x010100460DEE0F2C44F94598A5259A77A6205B" ma:contentTypeVersion="19" ma:contentTypeDescription="Crear nuevo documento." ma:contentTypeScope="" ma:versionID="12159bb467302f72b7035e44db06965e">
   <xsd:schema xmlns:xsd="http://www.w3.org/2001/XMLSchema" xmlns:xs="http://www.w3.org/2001/XMLSchema" xmlns:p="http://schemas.microsoft.com/office/2006/metadata/properties" xmlns:ns2="2cad0c96-b44f-494c-bd1a-65b9e73a9232" xmlns:ns3="cb90855b-590b-4046-bde3-5b9a5aa76822" targetNamespace="http://schemas.microsoft.com/office/2006/metadata/properties" ma:root="true" ma:fieldsID="e266071875ede18c6d4a0178199cd205" ns2:_="" ns3:_="">
     <xsd:import namespace="2cad0c96-b44f-494c-bd1a-65b9e73a9232"/>
@@ -6275,30 +6066,35 @@
 </ct:contentTypeSchema>
 </file>
 
-<file path=customXml/item3.xml><?xml version="1.0" encoding="utf-8"?>
-<b:Sources xmlns:b="http://schemas.openxmlformats.org/officeDocument/2006/bibliography" xmlns="http://schemas.openxmlformats.org/officeDocument/2006/bibliography" SelectedStyle="\APASixthEditionOfficeOnline.xsl" StyleName="APA" Version="6"/>
-</file>
-
 <file path=customXml/item4.xml><?xml version="1.0" encoding="utf-8"?>
-<p:properties xmlns:p="http://schemas.microsoft.com/office/2006/metadata/properties" xmlns:xsi="http://www.w3.org/2001/XMLSchema-instance" xmlns:pc="http://schemas.microsoft.com/office/infopath/2007/PartnerControls">
-  <documentManagement>
-    <TaxCatchAll xmlns="cb90855b-590b-4046-bde3-5b9a5aa76822" xsi:nil="true"/>
-    <lcf76f155ced4ddcb4097134ff3c332f xmlns="2cad0c96-b44f-494c-bd1a-65b9e73a9232">
-      <Terms xmlns="http://schemas.microsoft.com/office/infopath/2007/PartnerControls"/>
-    </lcf76f155ced4ddcb4097134ff3c332f>
-  </documentManagement>
-</p:properties>
+<?mso-contentType ?>
+<FormTemplates xmlns="http://schemas.microsoft.com/sharepoint/v3/contenttype/forms">
+  <Display>DocumentLibraryForm</Display>
+  <Edit>DocumentLibraryForm</Edit>
+  <New>DocumentLibraryForm</New>
+</FormTemplates>
 </file>
 
 <file path=customXml/itemProps1.xml><?xml version="1.0" encoding="utf-8"?>
-<ds:datastoreItem xmlns:ds="http://schemas.openxmlformats.org/officeDocument/2006/customXml" ds:itemID="{09158215-ABC1-4C8A-81C3-31FD8C7011E1}">
+<ds:datastoreItem xmlns:ds="http://schemas.openxmlformats.org/officeDocument/2006/customXml" ds:itemID="{F03F4436-2075-4092-801C-949F844D4384}">
   <ds:schemaRefs>
-    <ds:schemaRef ds:uri="http://schemas.microsoft.com/sharepoint/v3/contenttype/forms"/>
+    <ds:schemaRef ds:uri="http://schemas.microsoft.com/office/2006/metadata/properties"/>
+    <ds:schemaRef ds:uri="http://schemas.microsoft.com/office/infopath/2007/PartnerControls"/>
+    <ds:schemaRef ds:uri="cb90855b-590b-4046-bde3-5b9a5aa76822"/>
+    <ds:schemaRef ds:uri="2cad0c96-b44f-494c-bd1a-65b9e73a9232"/>
   </ds:schemaRefs>
 </ds:datastoreItem>
 </file>
 
 <file path=customXml/itemProps2.xml><?xml version="1.0" encoding="utf-8"?>
+<ds:datastoreItem xmlns:ds="http://schemas.openxmlformats.org/officeDocument/2006/customXml" ds:itemID="{D133E733-E5B2-4980-98FD-328B0BF20160}">
+  <ds:schemaRefs>
+    <ds:schemaRef ds:uri="http://schemas.openxmlformats.org/officeDocument/2006/bibliography"/>
+  </ds:schemaRefs>
+</ds:datastoreItem>
+</file>
+
+<file path=customXml/itemProps3.xml><?xml version="1.0" encoding="utf-8"?>
 <ds:datastoreItem xmlns:ds="http://schemas.openxmlformats.org/officeDocument/2006/customXml" ds:itemID="{3D0B542A-4213-4A61-A9B5-4CBEBF54F69E}">
   <ds:schemaRefs>
     <ds:schemaRef ds:uri="http://schemas.microsoft.com/office/2006/metadata/contentType"/>
@@ -6317,21 +6113,10 @@
 </ds:datastoreItem>
 </file>
 
-<file path=customXml/itemProps3.xml><?xml version="1.0" encoding="utf-8"?>
-<ds:datastoreItem xmlns:ds="http://schemas.openxmlformats.org/officeDocument/2006/customXml" ds:itemID="{D133E733-E5B2-4980-98FD-328B0BF20160}">
+<file path=customXml/itemProps4.xml><?xml version="1.0" encoding="utf-8"?>
+<ds:datastoreItem xmlns:ds="http://schemas.openxmlformats.org/officeDocument/2006/customXml" ds:itemID="{09158215-ABC1-4C8A-81C3-31FD8C7011E1}">
   <ds:schemaRefs>
-    <ds:schemaRef ds:uri="http://schemas.openxmlformats.org/officeDocument/2006/bibliography"/>
-  </ds:schemaRefs>
-</ds:datastoreItem>
-</file>
-
-<file path=customXml/itemProps4.xml><?xml version="1.0" encoding="utf-8"?>
-<ds:datastoreItem xmlns:ds="http://schemas.openxmlformats.org/officeDocument/2006/customXml" ds:itemID="{F03F4436-2075-4092-801C-949F844D4384}">
-  <ds:schemaRefs>
-    <ds:schemaRef ds:uri="http://schemas.microsoft.com/office/2006/metadata/properties"/>
-    <ds:schemaRef ds:uri="http://schemas.microsoft.com/office/infopath/2007/PartnerControls"/>
-    <ds:schemaRef ds:uri="cb90855b-590b-4046-bde3-5b9a5aa76822"/>
-    <ds:schemaRef ds:uri="2cad0c96-b44f-494c-bd1a-65b9e73a9232"/>
+    <ds:schemaRef ds:uri="http://schemas.microsoft.com/sharepoint/v3/contenttype/forms"/>
   </ds:schemaRefs>
 </ds:datastoreItem>
 </file>
</xml_diff>